<commit_message>
docs: agrega el numero de diapositiva a los marcadores de los guiones
</commit_message>
<xml_diff>
--- a/docs/capacitacion/guion youtube/anteriores-6-videos/video-1-el-problema/video-1-el-problema-natural.docx
+++ b/docs/capacitacion/guion youtube/anteriores-6-videos/video-1-el-problema/video-1-el-problema-natural.docx
@@ -26,7 +26,7 @@
           <w:b/>
           <w:color w:val="1F4E9A"/>
         </w:rPr>
-        <w:t>[Diapositiva · BioImage-Repro UAM]</w:t>
+        <w:t>[Diapositiva 1 · BioImage-Repro UAM]</w:t>
       </w:r>
     </w:p>
     <w:p>
@@ -57,7 +57,7 @@
           <w:b/>
           <w:color w:val="1F4E9A"/>
         </w:rPr>
-        <w:t>[Diapositiva · ¿Qué es BioImage-Repro UAM?]</w:t>
+        <w:t>[Diapositiva 2 · ¿Qué es BioImage-Repro UAM?]</w:t>
       </w:r>
     </w:p>
     <w:p>
@@ -88,7 +88,7 @@
           <w:b/>
           <w:color w:val="1F4E9A"/>
         </w:rPr>
-        <w:t>[Diapositiva · Los cuatro módulos]</w:t>
+        <w:t>[Diapositiva 3 · Los cuatro módulos]</w:t>
       </w:r>
     </w:p>
     <w:p>
@@ -139,7 +139,7 @@
           <w:b/>
           <w:color w:val="1F4E9A"/>
         </w:rPr>
-        <w:t>[Diapositiva · La agenda de este módulo]</w:t>
+        <w:t>[Diapositiva 4 · La agenda de este módulo]</w:t>
       </w:r>
     </w:p>
     <w:p>
@@ -175,7 +175,7 @@
           <w:b/>
           <w:color w:val="1F4E9A"/>
         </w:rPr>
-        <w:t>[Diapositiva · La inteligencia artificial en la educación y la investigación]</w:t>
+        <w:t>[Diapositiva 5 · La inteligencia artificial en la educación y la investigación]</w:t>
       </w:r>
     </w:p>
     <w:p>
@@ -241,7 +241,7 @@
           <w:b/>
           <w:color w:val="1F4E9A"/>
         </w:rPr>
-        <w:t>[Diapositiva · Microscopía de fluorescencia]</w:t>
+        <w:t>[Diapositiva 6 · Microscopía de fluorescencia]</w:t>
       </w:r>
     </w:p>
     <w:p>
@@ -287,7 +287,7 @@
           <w:b/>
           <w:color w:val="1F4E9A"/>
         </w:rPr>
-        <w:t>[Diapositiva · El caso de estudio]</w:t>
+        <w:t>[Diapositiva 7 · El caso de estudio]</w:t>
       </w:r>
     </w:p>
     <w:p>
@@ -323,7 +323,7 @@
           <w:b/>
           <w:color w:val="1F4E9A"/>
         </w:rPr>
-        <w:t>[Diapositiva · Qué se quiere medir]</w:t>
+        <w:t>[Diapositiva 8 · Qué se quiere medir]</w:t>
       </w:r>
     </w:p>
     <w:p>
@@ -374,7 +374,7 @@
           <w:b/>
           <w:color w:val="1F4E9A"/>
         </w:rPr>
-        <w:t>[Diapositiva · Media y desviación estándar, con un ejemplo]</w:t>
+        <w:t>[Diapositiva 9 · Media y desviación estándar, con un ejemplo]</w:t>
       </w:r>
     </w:p>
     <w:p>
@@ -425,7 +425,7 @@
           <w:b/>
           <w:color w:val="1F4E9A"/>
         </w:rPr>
-        <w:t>[Diapositiva · Para qué sirven estas medidas en una investigación]</w:t>
+        <w:t>[Diapositiva 10 · Para qué sirven estas medidas en una investigación]</w:t>
       </w:r>
     </w:p>
     <w:p>
@@ -471,7 +471,7 @@
           <w:b/>
           <w:color w:val="1F4E9A"/>
         </w:rPr>
-        <w:t>[Diapositiva · Contar y medir a mano]</w:t>
+        <w:t>[Diapositiva 11 · Contar y medir a mano]</w:t>
       </w:r>
     </w:p>
     <w:p>
@@ -522,7 +522,7 @@
           <w:b/>
           <w:color w:val="1F4E9A"/>
         </w:rPr>
-        <w:t>[Diapositiva · Un día de trabajo sin el sistema]</w:t>
+        <w:t>[Diapositiva 12 · Un día de trabajo sin el sistema]</w:t>
       </w:r>
     </w:p>
     <w:p>
@@ -573,7 +573,7 @@
           <w:b/>
           <w:color w:val="1F4E9A"/>
         </w:rPr>
-        <w:t>[Diapositiva · El camino de una imagen a un número]</w:t>
+        <w:t>[Diapositiva 13 · El camino de una imagen a un número]</w:t>
       </w:r>
     </w:p>
     <w:p>

</xml_diff>

<commit_message>
docs: quita frases de publico presente y corrige errores en los guiones
</commit_message>
<xml_diff>
--- a/docs/capacitacion/guion youtube/anteriores-6-videos/video-1-el-problema/video-1-el-problema-natural.docx
+++ b/docs/capacitacion/guion youtube/anteriores-6-videos/video-1-el-problema/video-1-el-problema-natural.docx
@@ -192,7 +192,7 @@
     </w:p>
     <w:p>
       <w:r>
-        <w:t>Empiezo con una pregunta, y no hace falta que la contesten en voz alta: ¿para qué sirve la inteligencia artificial en la educación y en la investigación? Hay muchas respuestas. Una, la que nos interesa hoy, es analizar imágenes. Una persona mira una imagen y reconoce lo que hay en ella. Un programa que aprendió de muchos ejemplos puede hacer algo parecido... y puede hacerlo una y otra vez, sin cansarse.</w:t>
+        <w:t>Empiezo con una pregunta: ¿para qué sirve la inteligencia artificial en la educación y en la investigación? Hay muchas respuestas. Una, la que nos interesa hoy, es analizar imágenes. Una persona mira una imagen y reconoce lo que hay en ella. Un programa que aprendió de muchos ejemplos puede hacer algo parecido... y puede hacerlo una y otra vez, sin cansarse.</w:t>
       </w:r>
     </w:p>
     <w:p>
@@ -304,7 +304,7 @@
     </w:p>
     <w:p>
       <w:r>
-        <w:t>Les muestro cómo se ve el problema. Esta es una imagen de fluorescencia: manchas brillantes de colores sobre un fondo oscuro. Cada mancha es la cabeza de un espermatozoide, y a veces se alcanza a ver una línea que sale de ella, la cola. Ahora pregunto, sin esperar respuesta: ¿cuántos hay en esta imagen? Lo primero que haría cualquiera es contarlos con la vista, uno por uno. Y si además hay que medir cada uno, ya no basta con mirar.</w:t>
+        <w:t>Les muestro cómo se ve el problema. Esta es una imagen de fluorescencia: manchas brillantes de colores sobre un fondo oscuro. Cada mancha es la cabeza de un espermatozoide, y a veces se alcanza a ver una línea que sale de ella, la cola. ¿Cuántos hay en esta imagen? Lo primero que haría cualquiera es contarlos con la vista, uno por uno. Y si además hay que medir cada uno, ya no basta con mirar.</w:t>
       </w:r>
     </w:p>
     <w:p>

</xml_diff>